<commit_message>
Kapitel 3.7 + 5: Datenschutz- und urheberrechtliche Hinweise ergänzt
</commit_message>
<xml_diff>
--- a/lehrerhandreichung_klimawandel8.docx
+++ b/lehrerhandreichung_klimawandel8.docx
@@ -4018,6 +4018,1674 @@
       </w:tr>
     </w:tbl>
     <w:p>
+      <w:pPr>
+        <w:pStyle w:val="Heading2"/>
+        <w:spacing w:after="80" w:before="280"/>
+      </w:pPr>
+      <w:r>
+        <w:rPr>
+          <w:rFonts w:ascii="Arial" w:cs="Arial" w:eastAsia="Arial" w:hAnsi="Arial"/>
+          <w:b/>
+          <w:bCs/>
+          <w:color w:val="2E6FA3"/>
+          <w:sz w:val="26"/>
+          <w:szCs w:val="26"/>
+        </w:rPr>
+        <w:t xml:space="preserve">3.7  Datenschutz- und urheberrechtliche Entscheidungen</w:t>
+      </w:r>
+    </w:p>
+    <w:p>
+      <w:pPr>
+        <w:spacing w:after="100" w:before="60"/>
+        <w:jc w:val="both"/>
+      </w:pPr>
+      <w:r>
+        <w:rPr>
+          <w:rFonts w:ascii="Arial" w:cs="Arial" w:eastAsia="Arial" w:hAnsi="Arial"/>
+          <w:color w:val="000000"/>
+          <w:sz w:val="22"/>
+          <w:szCs w:val="22"/>
+        </w:rPr>
+        <w:t xml:space="preserve">Beim Einsatz digitaler Lernmaterialien in der Schule sind Datenschutz und Urheberrecht verbindliche Rahmenbedingungen. Für diesen Escape Room wurden bewusst Entscheidungen getroffen, die beide Aspekte vollständig berücksichtigen.</w:t>
+      </w:r>
+    </w:p>
+    <w:p>
+      <w:pPr>
+        <w:spacing w:after="60" w:before="0"/>
+      </w:pPr>
+      <w:r>
+        <w:t xml:space="preserve"/>
+      </w:r>
+    </w:p>
+    <w:p>
+      <w:pPr>
+        <w:pStyle w:val="Heading3"/>
+        <w:spacing w:after="60" w:before="200"/>
+      </w:pPr>
+      <w:r>
+        <w:rPr>
+          <w:rFonts w:ascii="Arial" w:cs="Arial" w:eastAsia="Arial" w:hAnsi="Arial"/>
+          <w:b/>
+          <w:bCs/>
+          <w:color w:val="1A3A5C"/>
+          <w:sz w:val="22"/>
+          <w:szCs w:val="22"/>
+        </w:rPr>
+        <w:t xml:space="preserve">Schriftarten – SIL Open Font License (OFL 1.1)</w:t>
+      </w:r>
+    </w:p>
+    <w:p>
+      <w:pPr>
+        <w:spacing w:after="100" w:before="60"/>
+        <w:jc w:val="both"/>
+      </w:pPr>
+      <w:r>
+        <w:rPr>
+          <w:rFonts w:ascii="Arial" w:cs="Arial" w:eastAsia="Arial" w:hAnsi="Arial"/>
+          <w:color w:val="000000"/>
+          <w:sz w:val="22"/>
+          <w:szCs w:val="22"/>
+        </w:rPr>
+        <w:t xml:space="preserve">Der Escape Room verwendet drei Schriftarten, die alle unter der SIL Open Font License Version 1.1 stehen. Diese Lizenz erlaubt die freie Nutzung, Einbettung und Weitergabe – auch im schulischen und öffentlichen Kontext – ohne Lizenzgebühren:</w:t>
+      </w:r>
+    </w:p>
+    <w:tbl>
+      <w:tblPr>
+        <w:tblW w:type="dxa" w:w="9026"/>
+        <w:tblBorders>
+          <w:top w:val="single" w:color="auto" w:sz="4"/>
+          <w:left w:val="single" w:color="auto" w:sz="4"/>
+          <w:bottom w:val="single" w:color="auto" w:sz="4"/>
+          <w:right w:val="single" w:color="auto" w:sz="4"/>
+          <w:insideH w:val="single" w:color="auto" w:sz="4"/>
+          <w:insideV w:val="single" w:color="auto" w:sz="4"/>
+        </w:tblBorders>
+      </w:tblPr>
+      <w:tblGrid>
+        <w:gridCol w:w="2500"/>
+        <w:gridCol w:w="3800"/>
+        <w:gridCol w:w="2726"/>
+      </w:tblGrid>
+      <w:tr>
+        <w:trPr>
+          <w:tblHeader/>
+        </w:trPr>
+        <w:tc>
+          <w:tcPr>
+            <w:tcW w:type="dxa" w:w="2500"/>
+            <w:tcBorders>
+              <w:top w:val="single" w:color="AABBD0" w:sz="4"/>
+              <w:left w:val="single" w:color="AABBD0" w:sz="4"/>
+              <w:bottom w:val="single" w:color="AABBD0" w:sz="4"/>
+              <w:right w:val="single" w:color="AABBD0" w:sz="4"/>
+            </w:tcBorders>
+            <w:shd w:fill="1A3A5C" w:val="clear"/>
+            <w:tcMar>
+              <w:top w:type="dxa" w:w="80"/>
+              <w:left w:type="dxa" w:w="120"/>
+              <w:bottom w:type="dxa" w:w="80"/>
+              <w:right w:type="dxa" w:w="120"/>
+            </w:tcMar>
+          </w:tcPr>
+          <w:p>
+            <w:r>
+              <w:rPr>
+                <w:rFonts w:ascii="Arial" w:cs="Arial" w:eastAsia="Arial" w:hAnsi="Arial"/>
+                <w:b/>
+                <w:bCs/>
+                <w:color w:val="FFFFFF"/>
+                <w:sz w:val="20"/>
+                <w:szCs w:val="20"/>
+              </w:rPr>
+              <w:t xml:space="preserve">Schriftart</w:t>
+            </w:r>
+          </w:p>
+        </w:tc>
+        <w:tc>
+          <w:tcPr>
+            <w:tcW w:type="dxa" w:w="3800"/>
+            <w:tcBorders>
+              <w:top w:val="single" w:color="AABBD0" w:sz="4"/>
+              <w:left w:val="single" w:color="AABBD0" w:sz="4"/>
+              <w:bottom w:val="single" w:color="AABBD0" w:sz="4"/>
+              <w:right w:val="single" w:color="AABBD0" w:sz="4"/>
+            </w:tcBorders>
+            <w:shd w:fill="1A3A5C" w:val="clear"/>
+            <w:tcMar>
+              <w:top w:type="dxa" w:w="80"/>
+              <w:left w:type="dxa" w:w="120"/>
+              <w:bottom w:type="dxa" w:w="80"/>
+              <w:right w:type="dxa" w:w="120"/>
+            </w:tcMar>
+          </w:tcPr>
+          <w:p>
+            <w:r>
+              <w:rPr>
+                <w:rFonts w:ascii="Arial" w:cs="Arial" w:eastAsia="Arial" w:hAnsi="Arial"/>
+                <w:b/>
+                <w:bCs/>
+                <w:color w:val="FFFFFF"/>
+                <w:sz w:val="20"/>
+                <w:szCs w:val="20"/>
+              </w:rPr>
+              <w:t xml:space="preserve">Urheber</w:t>
+            </w:r>
+          </w:p>
+        </w:tc>
+        <w:tc>
+          <w:tcPr>
+            <w:tcW w:type="dxa" w:w="2726"/>
+            <w:tcBorders>
+              <w:top w:val="single" w:color="AABBD0" w:sz="4"/>
+              <w:left w:val="single" w:color="AABBD0" w:sz="4"/>
+              <w:bottom w:val="single" w:color="AABBD0" w:sz="4"/>
+              <w:right w:val="single" w:color="AABBD0" w:sz="4"/>
+            </w:tcBorders>
+            <w:shd w:fill="1A3A5C" w:val="clear"/>
+            <w:tcMar>
+              <w:top w:type="dxa" w:w="80"/>
+              <w:left w:type="dxa" w:w="120"/>
+              <w:bottom w:type="dxa" w:w="80"/>
+              <w:right w:type="dxa" w:w="120"/>
+            </w:tcMar>
+          </w:tcPr>
+          <w:p>
+            <w:r>
+              <w:rPr>
+                <w:rFonts w:ascii="Arial" w:cs="Arial" w:eastAsia="Arial" w:hAnsi="Arial"/>
+                <w:b/>
+                <w:bCs/>
+                <w:color w:val="FFFFFF"/>
+                <w:sz w:val="20"/>
+                <w:szCs w:val="20"/>
+              </w:rPr>
+              <w:t xml:space="preserve">Lizenz</w:t>
+            </w:r>
+          </w:p>
+        </w:tc>
+      </w:tr>
+      <w:tr>
+        <w:tc>
+          <w:tcPr>
+            <w:tcW w:type="dxa" w:w="2500"/>
+            <w:tcBorders>
+              <w:top w:val="single" w:color="AABBD0" w:sz="4"/>
+              <w:left w:val="single" w:color="AABBD0" w:sz="4"/>
+              <w:bottom w:val="single" w:color="AABBD0" w:sz="4"/>
+              <w:right w:val="single" w:color="AABBD0" w:sz="4"/>
+            </w:tcBorders>
+            <w:shd w:fill="F2F4F7" w:val="clear"/>
+            <w:tcMar>
+              <w:top w:type="dxa" w:w="80"/>
+              <w:left w:type="dxa" w:w="120"/>
+              <w:bottom w:type="dxa" w:w="80"/>
+              <w:right w:type="dxa" w:w="120"/>
+            </w:tcMar>
+          </w:tcPr>
+          <w:p>
+            <w:r>
+              <w:rPr>
+                <w:rFonts w:ascii="Arial" w:cs="Arial" w:eastAsia="Arial" w:hAnsi="Arial"/>
+                <w:b w:val="false"/>
+                <w:bCs w:val="false"/>
+                <w:color w:val="000000"/>
+                <w:sz w:val="20"/>
+                <w:szCs w:val="20"/>
+              </w:rPr>
+              <w:t xml:space="preserve">Orbitron</w:t>
+            </w:r>
+          </w:p>
+        </w:tc>
+        <w:tc>
+          <w:tcPr>
+            <w:tcW w:type="dxa" w:w="3800"/>
+            <w:tcBorders>
+              <w:top w:val="single" w:color="AABBD0" w:sz="4"/>
+              <w:left w:val="single" w:color="AABBD0" w:sz="4"/>
+              <w:bottom w:val="single" w:color="AABBD0" w:sz="4"/>
+              <w:right w:val="single" w:color="AABBD0" w:sz="4"/>
+            </w:tcBorders>
+            <w:shd w:fill="F2F4F7" w:val="clear"/>
+            <w:tcMar>
+              <w:top w:type="dxa" w:w="80"/>
+              <w:left w:type="dxa" w:w="120"/>
+              <w:bottom w:type="dxa" w:w="80"/>
+              <w:right w:type="dxa" w:w="120"/>
+            </w:tcMar>
+          </w:tcPr>
+          <w:p>
+            <w:r>
+              <w:rPr>
+                <w:rFonts w:ascii="Arial" w:cs="Arial" w:eastAsia="Arial" w:hAnsi="Arial"/>
+                <w:b w:val="false"/>
+                <w:bCs w:val="false"/>
+                <w:color w:val="000000"/>
+                <w:sz w:val="20"/>
+                <w:szCs w:val="20"/>
+              </w:rPr>
+              <w:t xml:space="preserve">© 2018 The Orbitron Project Authors</w:t>
+            </w:r>
+          </w:p>
+        </w:tc>
+        <w:tc>
+          <w:tcPr>
+            <w:tcW w:type="dxa" w:w="2726"/>
+            <w:tcBorders>
+              <w:top w:val="single" w:color="AABBD0" w:sz="4"/>
+              <w:left w:val="single" w:color="AABBD0" w:sz="4"/>
+              <w:bottom w:val="single" w:color="AABBD0" w:sz="4"/>
+              <w:right w:val="single" w:color="AABBD0" w:sz="4"/>
+            </w:tcBorders>
+            <w:shd w:fill="F2F4F7" w:val="clear"/>
+            <w:tcMar>
+              <w:top w:type="dxa" w:w="80"/>
+              <w:left w:type="dxa" w:w="120"/>
+              <w:bottom w:type="dxa" w:w="80"/>
+              <w:right w:type="dxa" w:w="120"/>
+            </w:tcMar>
+          </w:tcPr>
+          <w:p>
+            <w:r>
+              <w:rPr>
+                <w:rFonts w:ascii="Arial" w:cs="Arial" w:eastAsia="Arial" w:hAnsi="Arial"/>
+                <w:b w:val="false"/>
+                <w:bCs w:val="false"/>
+                <w:color w:val="000000"/>
+                <w:sz w:val="20"/>
+                <w:szCs w:val="20"/>
+              </w:rPr>
+              <w:t xml:space="preserve">SIL Open Font License 1.1</w:t>
+            </w:r>
+          </w:p>
+        </w:tc>
+      </w:tr>
+      <w:tr>
+        <w:tc>
+          <w:tcPr>
+            <w:tcW w:type="dxa" w:w="2500"/>
+            <w:tcBorders>
+              <w:top w:val="single" w:color="AABBD0" w:sz="4"/>
+              <w:left w:val="single" w:color="AABBD0" w:sz="4"/>
+              <w:bottom w:val="single" w:color="AABBD0" w:sz="4"/>
+              <w:right w:val="single" w:color="AABBD0" w:sz="4"/>
+            </w:tcBorders>
+            <w:shd w:fill="FFFFFF" w:val="clear"/>
+            <w:tcMar>
+              <w:top w:type="dxa" w:w="80"/>
+              <w:left w:type="dxa" w:w="120"/>
+              <w:bottom w:type="dxa" w:w="80"/>
+              <w:right w:type="dxa" w:w="120"/>
+            </w:tcMar>
+          </w:tcPr>
+          <w:p>
+            <w:r>
+              <w:rPr>
+                <w:rFonts w:ascii="Arial" w:cs="Arial" w:eastAsia="Arial" w:hAnsi="Arial"/>
+                <w:b w:val="false"/>
+                <w:bCs w:val="false"/>
+                <w:color w:val="000000"/>
+                <w:sz w:val="20"/>
+                <w:szCs w:val="20"/>
+              </w:rPr>
+              <w:t xml:space="preserve">JetBrains Mono</w:t>
+            </w:r>
+          </w:p>
+        </w:tc>
+        <w:tc>
+          <w:tcPr>
+            <w:tcW w:type="dxa" w:w="3800"/>
+            <w:tcBorders>
+              <w:top w:val="single" w:color="AABBD0" w:sz="4"/>
+              <w:left w:val="single" w:color="AABBD0" w:sz="4"/>
+              <w:bottom w:val="single" w:color="AABBD0" w:sz="4"/>
+              <w:right w:val="single" w:color="AABBD0" w:sz="4"/>
+            </w:tcBorders>
+            <w:shd w:fill="FFFFFF" w:val="clear"/>
+            <w:tcMar>
+              <w:top w:type="dxa" w:w="80"/>
+              <w:left w:type="dxa" w:w="120"/>
+              <w:bottom w:type="dxa" w:w="80"/>
+              <w:right w:type="dxa" w:w="120"/>
+            </w:tcMar>
+          </w:tcPr>
+          <w:p>
+            <w:r>
+              <w:rPr>
+                <w:rFonts w:ascii="Arial" w:cs="Arial" w:eastAsia="Arial" w:hAnsi="Arial"/>
+                <w:b w:val="false"/>
+                <w:bCs w:val="false"/>
+                <w:color w:val="000000"/>
+                <w:sz w:val="20"/>
+                <w:szCs w:val="20"/>
+              </w:rPr>
+              <w:t xml:space="preserve">© 2020 The JetBrains Mono Project Authors</w:t>
+            </w:r>
+          </w:p>
+        </w:tc>
+        <w:tc>
+          <w:tcPr>
+            <w:tcW w:type="dxa" w:w="2726"/>
+            <w:tcBorders>
+              <w:top w:val="single" w:color="AABBD0" w:sz="4"/>
+              <w:left w:val="single" w:color="AABBD0" w:sz="4"/>
+              <w:bottom w:val="single" w:color="AABBD0" w:sz="4"/>
+              <w:right w:val="single" w:color="AABBD0" w:sz="4"/>
+            </w:tcBorders>
+            <w:shd w:fill="FFFFFF" w:val="clear"/>
+            <w:tcMar>
+              <w:top w:type="dxa" w:w="80"/>
+              <w:left w:type="dxa" w:w="120"/>
+              <w:bottom w:type="dxa" w:w="80"/>
+              <w:right w:type="dxa" w:w="120"/>
+            </w:tcMar>
+          </w:tcPr>
+          <w:p>
+            <w:r>
+              <w:rPr>
+                <w:rFonts w:ascii="Arial" w:cs="Arial" w:eastAsia="Arial" w:hAnsi="Arial"/>
+                <w:b w:val="false"/>
+                <w:bCs w:val="false"/>
+                <w:color w:val="000000"/>
+                <w:sz w:val="20"/>
+                <w:szCs w:val="20"/>
+              </w:rPr>
+              <w:t xml:space="preserve">SIL Open Font License 1.1</w:t>
+            </w:r>
+          </w:p>
+        </w:tc>
+      </w:tr>
+      <w:tr>
+        <w:tc>
+          <w:tcPr>
+            <w:tcW w:type="dxa" w:w="2500"/>
+            <w:tcBorders>
+              <w:top w:val="single" w:color="AABBD0" w:sz="4"/>
+              <w:left w:val="single" w:color="AABBD0" w:sz="4"/>
+              <w:bottom w:val="single" w:color="AABBD0" w:sz="4"/>
+              <w:right w:val="single" w:color="AABBD0" w:sz="4"/>
+            </w:tcBorders>
+            <w:shd w:fill="F2F4F7" w:val="clear"/>
+            <w:tcMar>
+              <w:top w:type="dxa" w:w="80"/>
+              <w:left w:type="dxa" w:w="120"/>
+              <w:bottom w:type="dxa" w:w="80"/>
+              <w:right w:type="dxa" w:w="120"/>
+            </w:tcMar>
+          </w:tcPr>
+          <w:p>
+            <w:r>
+              <w:rPr>
+                <w:rFonts w:ascii="Arial" w:cs="Arial" w:eastAsia="Arial" w:hAnsi="Arial"/>
+                <w:b w:val="false"/>
+                <w:bCs w:val="false"/>
+                <w:color w:val="000000"/>
+                <w:sz w:val="20"/>
+                <w:szCs w:val="20"/>
+              </w:rPr>
+              <w:t xml:space="preserve">Manrope</w:t>
+            </w:r>
+          </w:p>
+        </w:tc>
+        <w:tc>
+          <w:tcPr>
+            <w:tcW w:type="dxa" w:w="3800"/>
+            <w:tcBorders>
+              <w:top w:val="single" w:color="AABBD0" w:sz="4"/>
+              <w:left w:val="single" w:color="AABBD0" w:sz="4"/>
+              <w:bottom w:val="single" w:color="AABBD0" w:sz="4"/>
+              <w:right w:val="single" w:color="AABBD0" w:sz="4"/>
+            </w:tcBorders>
+            <w:shd w:fill="F2F4F7" w:val="clear"/>
+            <w:tcMar>
+              <w:top w:type="dxa" w:w="80"/>
+              <w:left w:type="dxa" w:w="120"/>
+              <w:bottom w:type="dxa" w:w="80"/>
+              <w:right w:type="dxa" w:w="120"/>
+            </w:tcMar>
+          </w:tcPr>
+          <w:p>
+            <w:r>
+              <w:rPr>
+                <w:rFonts w:ascii="Arial" w:cs="Arial" w:eastAsia="Arial" w:hAnsi="Arial"/>
+                <w:b w:val="false"/>
+                <w:bCs w:val="false"/>
+                <w:color w:val="000000"/>
+                <w:sz w:val="20"/>
+                <w:szCs w:val="20"/>
+              </w:rPr>
+              <w:t xml:space="preserve">© 2018 The Manrope Project Authors (M. Sharanda)</w:t>
+            </w:r>
+          </w:p>
+        </w:tc>
+        <w:tc>
+          <w:tcPr>
+            <w:tcW w:type="dxa" w:w="2726"/>
+            <w:tcBorders>
+              <w:top w:val="single" w:color="AABBD0" w:sz="4"/>
+              <w:left w:val="single" w:color="AABBD0" w:sz="4"/>
+              <w:bottom w:val="single" w:color="AABBD0" w:sz="4"/>
+              <w:right w:val="single" w:color="AABBD0" w:sz="4"/>
+            </w:tcBorders>
+            <w:shd w:fill="F2F4F7" w:val="clear"/>
+            <w:tcMar>
+              <w:top w:type="dxa" w:w="80"/>
+              <w:left w:type="dxa" w:w="120"/>
+              <w:bottom w:type="dxa" w:w="80"/>
+              <w:right w:type="dxa" w:w="120"/>
+            </w:tcMar>
+          </w:tcPr>
+          <w:p>
+            <w:r>
+              <w:rPr>
+                <w:rFonts w:ascii="Arial" w:cs="Arial" w:eastAsia="Arial" w:hAnsi="Arial"/>
+                <w:b w:val="false"/>
+                <w:bCs w:val="false"/>
+                <w:color w:val="000000"/>
+                <w:sz w:val="20"/>
+                <w:szCs w:val="20"/>
+              </w:rPr>
+              <w:t xml:space="preserve">SIL Open Font License 1.1</w:t>
+            </w:r>
+          </w:p>
+        </w:tc>
+      </w:tr>
+    </w:tbl>
+    <w:p>
+      <w:pPr>
+        <w:spacing w:after="60" w:before="0"/>
+      </w:pPr>
+      <w:r>
+        <w:t xml:space="preserve"/>
+      </w:r>
+    </w:p>
+    <w:p>
+      <w:pPr>
+        <w:pStyle w:val="Heading3"/>
+        <w:spacing w:after="60" w:before="200"/>
+      </w:pPr>
+      <w:r>
+        <w:rPr>
+          <w:rFonts w:ascii="Arial" w:cs="Arial" w:eastAsia="Arial" w:hAnsi="Arial"/>
+          <w:b/>
+          <w:bCs/>
+          <w:color w:val="1A3A5C"/>
+          <w:sz w:val="22"/>
+          <w:szCs w:val="22"/>
+        </w:rPr>
+        <w:t xml:space="preserve">DSGVO-Konformität – Keine externen Serveranfragen</w:t>
+      </w:r>
+    </w:p>
+    <w:tbl>
+      <w:tblPr>
+        <w:tblW w:type="dxa" w:w="9026"/>
+        <w:tblBorders>
+          <w:top w:val="single" w:color="auto" w:sz="4"/>
+          <w:left w:val="single" w:color="auto" w:sz="4"/>
+          <w:bottom w:val="single" w:color="auto" w:sz="4"/>
+          <w:right w:val="single" w:color="auto" w:sz="4"/>
+          <w:insideH w:val="single" w:color="auto" w:sz="4"/>
+          <w:insideV w:val="single" w:color="auto" w:sz="4"/>
+        </w:tblBorders>
+      </w:tblPr>
+      <w:tblGrid>
+        <w:gridCol w:w="9026"/>
+      </w:tblGrid>
+      <w:tr>
+        <w:tc>
+          <w:tcPr>
+            <w:tcW w:type="dxa" w:w="9026"/>
+            <w:tcBorders>
+              <w:top w:val="single" w:color="C0392B" w:sz="4"/>
+              <w:left w:val="single" w:color="C0392B" w:sz="4"/>
+              <w:bottom w:val="single" w:color="C0392B" w:sz="4"/>
+              <w:right w:val="single" w:color="C0392B" w:sz="4"/>
+            </w:tcBorders>
+            <w:shd w:fill="2E6FA3" w:val="clear"/>
+            <w:tcMar>
+              <w:top w:type="dxa" w:w="80"/>
+              <w:left w:type="dxa" w:w="120"/>
+              <w:bottom w:type="dxa" w:w="80"/>
+              <w:right w:type="dxa" w:w="120"/>
+            </w:tcMar>
+          </w:tcPr>
+          <w:p>
+            <w:r>
+              <w:rPr>
+                <w:rFonts w:ascii="Arial" w:cs="Arial" w:eastAsia="Arial" w:hAnsi="Arial"/>
+                <w:b/>
+                <w:bCs/>
+                <w:color w:val="FFFFFF"/>
+                <w:sz w:val="22"/>
+                <w:szCs w:val="22"/>
+              </w:rPr>
+              <w:t xml:space="preserve">⚠  Ursprüngliches Problem: Google Fonts über CDN</w:t>
+            </w:r>
+          </w:p>
+        </w:tc>
+      </w:tr>
+      <w:tr>
+        <w:tc>
+          <w:tcPr>
+            <w:tcW w:type="dxa" w:w="9026"/>
+            <w:tcBorders>
+              <w:top w:val="single" w:color="C0392B" w:sz="4"/>
+              <w:left w:val="single" w:color="C0392B" w:sz="4"/>
+              <w:bottom w:val="single" w:color="C0392B" w:sz="4"/>
+              <w:right w:val="single" w:color="C0392B" w:sz="4"/>
+            </w:tcBorders>
+            <w:shd w:fill="FFF0F0" w:val="clear"/>
+            <w:tcMar>
+              <w:top w:type="dxa" w:w="60"/>
+              <w:left w:type="dxa" w:w="120"/>
+              <w:bottom w:type="dxa" w:w="60"/>
+              <w:right w:type="dxa" w:w="120"/>
+            </w:tcMar>
+          </w:tcPr>
+          <w:p>
+            <w:pPr>
+              <w:spacing w:after="40" w:before="40"/>
+            </w:pPr>
+            <w:r>
+              <w:rPr>
+                <w:rFonts w:ascii="Arial" w:cs="Arial" w:eastAsia="Arial" w:hAnsi="Arial"/>
+                <w:sz w:val="22"/>
+                <w:szCs w:val="22"/>
+              </w:rPr>
+              <w:t xml:space="preserve">Eine frühe Version des Escape Rooms lud die Schriftarten über Google Fonts (fonts.googleapis.com). Bei jedem Seitenaufruf wird dabei die IP-Adresse des Nutzers an Google-Server in den USA übermittelt – ohne Einwilligung der betroffenen Person.</w:t>
+            </w:r>
+          </w:p>
+        </w:tc>
+      </w:tr>
+      <w:tr>
+        <w:tc>
+          <w:tcPr>
+            <w:tcW w:type="dxa" w:w="9026"/>
+            <w:tcBorders>
+              <w:top w:val="single" w:color="C0392B" w:sz="4"/>
+              <w:left w:val="single" w:color="C0392B" w:sz="4"/>
+              <w:bottom w:val="single" w:color="C0392B" w:sz="4"/>
+              <w:right w:val="single" w:color="C0392B" w:sz="4"/>
+            </w:tcBorders>
+            <w:shd w:fill="FFF0F0" w:val="clear"/>
+            <w:tcMar>
+              <w:top w:type="dxa" w:w="60"/>
+              <w:left w:type="dxa" w:w="120"/>
+              <w:bottom w:type="dxa" w:w="60"/>
+              <w:right w:type="dxa" w:w="120"/>
+            </w:tcMar>
+          </w:tcPr>
+          <w:p>
+            <w:pPr>
+              <w:spacing w:after="40" w:before="40"/>
+            </w:pPr>
+            <w:r>
+              <w:rPr>
+                <w:rFonts w:ascii="Arial" w:cs="Arial" w:eastAsia="Arial" w:hAnsi="Arial"/>
+                <w:sz w:val="22"/>
+                <w:szCs w:val="22"/>
+              </w:rPr>
+              <w:t xml:space="preserve">Das Landgericht München I hat mit Urteil vom 20.01.2022 (Az. 3 O 17493/20) festgestellt, dass die Einbindung von Google Fonts ohne Einwilligung einen Verstoß gegen Art. 6 Abs. 1 DSGVO darstellt. Im schulischen Kontext mit Minderjährigen ist das Risiko besonders hoch.</w:t>
+            </w:r>
+          </w:p>
+        </w:tc>
+      </w:tr>
+    </w:tbl>
+    <w:p>
+      <w:pPr>
+        <w:spacing w:after="60" w:before="0"/>
+      </w:pPr>
+      <w:r>
+        <w:t xml:space="preserve"/>
+      </w:r>
+    </w:p>
+    <w:tbl>
+      <w:tblPr>
+        <w:tblW w:type="dxa" w:w="9026"/>
+        <w:tblBorders>
+          <w:top w:val="single" w:color="auto" w:sz="4"/>
+          <w:left w:val="single" w:color="auto" w:sz="4"/>
+          <w:bottom w:val="single" w:color="auto" w:sz="4"/>
+          <w:right w:val="single" w:color="auto" w:sz="4"/>
+          <w:insideH w:val="single" w:color="auto" w:sz="4"/>
+          <w:insideV w:val="single" w:color="auto" w:sz="4"/>
+        </w:tblBorders>
+      </w:tblPr>
+      <w:tblGrid>
+        <w:gridCol w:w="9026"/>
+      </w:tblGrid>
+      <w:tr>
+        <w:tc>
+          <w:tcPr>
+            <w:tcW w:type="dxa" w:w="9026"/>
+            <w:tcBorders>
+              <w:top w:val="single" w:color="1E6E3C" w:sz="4"/>
+              <w:left w:val="single" w:color="1E6E3C" w:sz="4"/>
+              <w:bottom w:val="single" w:color="1E6E3C" w:sz="4"/>
+              <w:right w:val="single" w:color="1E6E3C" w:sz="4"/>
+            </w:tcBorders>
+            <w:shd w:fill="2E6FA3" w:val="clear"/>
+            <w:tcMar>
+              <w:top w:type="dxa" w:w="80"/>
+              <w:left w:type="dxa" w:w="120"/>
+              <w:bottom w:type="dxa" w:w="80"/>
+              <w:right w:type="dxa" w:w="120"/>
+            </w:tcMar>
+          </w:tcPr>
+          <w:p>
+            <w:r>
+              <w:rPr>
+                <w:rFonts w:ascii="Arial" w:cs="Arial" w:eastAsia="Arial" w:hAnsi="Arial"/>
+                <w:b/>
+                <w:bCs/>
+                <w:color w:val="FFFFFF"/>
+                <w:sz w:val="22"/>
+                <w:szCs w:val="22"/>
+              </w:rPr>
+              <w:t xml:space="preserve">✓  Lösung: Fonts lokal eingebettet</w:t>
+            </w:r>
+          </w:p>
+        </w:tc>
+      </w:tr>
+      <w:tr>
+        <w:tc>
+          <w:tcPr>
+            <w:tcW w:type="dxa" w:w="9026"/>
+            <w:tcBorders>
+              <w:top w:val="single" w:color="1E6E3C" w:sz="4"/>
+              <w:left w:val="single" w:color="1E6E3C" w:sz="4"/>
+              <w:bottom w:val="single" w:color="1E6E3C" w:sz="4"/>
+              <w:right w:val="single" w:color="1E6E3C" w:sz="4"/>
+            </w:tcBorders>
+            <w:shd w:fill="E8F5EE" w:val="clear"/>
+            <w:tcMar>
+              <w:top w:type="dxa" w:w="60"/>
+              <w:left w:type="dxa" w:w="120"/>
+              <w:bottom w:type="dxa" w:w="60"/>
+              <w:right w:type="dxa" w:w="120"/>
+            </w:tcMar>
+          </w:tcPr>
+          <w:p>
+            <w:pPr>
+              <w:spacing w:after="40" w:before="40"/>
+            </w:pPr>
+            <w:r>
+              <w:rPr>
+                <w:rFonts w:ascii="Arial" w:cs="Arial" w:eastAsia="Arial" w:hAnsi="Arial"/>
+                <w:sz w:val="22"/>
+                <w:szCs w:val="22"/>
+              </w:rPr>
+              <w:t xml:space="preserve">In der vorliegenden Version sind alle drei Schriftarten als Base64-kodierte Daten direkt in die HTML-Datei eingebettet (via @font-face mit data:-URI). Die Seite macht keinerlei externe Netzwerkanfragen.</w:t>
+            </w:r>
+          </w:p>
+        </w:tc>
+      </w:tr>
+      <w:tr>
+        <w:tc>
+          <w:tcPr>
+            <w:tcW w:type="dxa" w:w="9026"/>
+            <w:tcBorders>
+              <w:top w:val="single" w:color="1E6E3C" w:sz="4"/>
+              <w:left w:val="single" w:color="1E6E3C" w:sz="4"/>
+              <w:bottom w:val="single" w:color="1E6E3C" w:sz="4"/>
+              <w:right w:val="single" w:color="1E6E3C" w:sz="4"/>
+            </w:tcBorders>
+            <w:shd w:fill="E8F5EE" w:val="clear"/>
+            <w:tcMar>
+              <w:top w:type="dxa" w:w="60"/>
+              <w:left w:type="dxa" w:w="120"/>
+              <w:bottom w:type="dxa" w:w="60"/>
+              <w:right w:type="dxa" w:w="120"/>
+            </w:tcMar>
+          </w:tcPr>
+          <w:p>
+            <w:pPr>
+              <w:spacing w:after="40" w:before="40"/>
+            </w:pPr>
+            <w:r>
+              <w:rPr>
+                <w:rFonts w:ascii="Arial" w:cs="Arial" w:eastAsia="Arial" w:hAnsi="Arial"/>
+                <w:sz w:val="22"/>
+                <w:szCs w:val="22"/>
+              </w:rPr>
+              <w:t xml:space="preserve">Konsequenz: Die Datei ist vollständig offline-fähig, DSGVO-konform und benötigt keine Internetverbindung. Schülerdaten (IP-Adressen, Nutzungsverhalten) werden zu keinem Zeitpunkt an Dritte übermittelt.</w:t>
+            </w:r>
+          </w:p>
+        </w:tc>
+      </w:tr>
+      <w:tr>
+        <w:tc>
+          <w:tcPr>
+            <w:tcW w:type="dxa" w:w="9026"/>
+            <w:tcBorders>
+              <w:top w:val="single" w:color="1E6E3C" w:sz="4"/>
+              <w:left w:val="single" w:color="1E6E3C" w:sz="4"/>
+              <w:bottom w:val="single" w:color="1E6E3C" w:sz="4"/>
+              <w:right w:val="single" w:color="1E6E3C" w:sz="4"/>
+            </w:tcBorders>
+            <w:shd w:fill="E8F5EE" w:val="clear"/>
+            <w:tcMar>
+              <w:top w:type="dxa" w:w="60"/>
+              <w:left w:type="dxa" w:w="120"/>
+              <w:bottom w:type="dxa" w:w="60"/>
+              <w:right w:type="dxa" w:w="120"/>
+            </w:tcMar>
+          </w:tcPr>
+          <w:p>
+            <w:pPr>
+              <w:spacing w:after="40" w:before="40"/>
+            </w:pPr>
+            <w:r>
+              <w:rPr>
+                <w:rFonts w:ascii="Arial" w:cs="Arial" w:eastAsia="Arial" w:hAnsi="Arial"/>
+                <w:sz w:val="22"/>
+                <w:szCs w:val="22"/>
+              </w:rPr>
+              <w:t xml:space="preserve">Nachweis: Eine Inspektion der HTML-Datei zeigt keine einzige externe URL außer dem W3C-Namespace (w3.org/2000/svg), der keinerlei Datenübertragung auslöst.</w:t>
+            </w:r>
+          </w:p>
+        </w:tc>
+      </w:tr>
+    </w:tbl>
+    <w:p>
+      <w:pPr>
+        <w:spacing w:after="60" w:before="0"/>
+      </w:pPr>
+      <w:r>
+        <w:t xml:space="preserve"/>
+      </w:r>
+    </w:p>
+    <w:p>
+      <w:pPr>
+        <w:pStyle w:val="Heading3"/>
+        <w:spacing w:after="60" w:before="200"/>
+      </w:pPr>
+      <w:r>
+        <w:rPr>
+          <w:rFonts w:ascii="Arial" w:cs="Arial" w:eastAsia="Arial" w:hAnsi="Arial"/>
+          <w:b/>
+          <w:bCs/>
+          <w:color w:val="1A3A5C"/>
+          <w:sz w:val="22"/>
+          <w:szCs w:val="22"/>
+        </w:rPr>
+        <w:t xml:space="preserve">Urheberrecht – Grafiken und Diagramme</w:t>
+      </w:r>
+    </w:p>
+    <w:p>
+      <w:pPr>
+        <w:spacing w:after="100" w:before="60"/>
+        <w:jc w:val="both"/>
+      </w:pPr>
+      <w:r>
+        <w:rPr>
+          <w:rFonts w:ascii="Arial" w:cs="Arial" w:eastAsia="Arial" w:hAnsi="Arial"/>
+          <w:color w:val="000000"/>
+          <w:sz w:val="22"/>
+          <w:szCs w:val="22"/>
+        </w:rPr>
+        <w:t xml:space="preserve">Sämtliche Grafiken im Escape Room sind eigenständig erstellt:</w:t>
+      </w:r>
+    </w:p>
+    <w:p>
+      <w:pPr>
+        <w:pStyle w:val="ListParagraph"/>
+        <w:numPr>
+          <w:ilvl w:val="0"/>
+          <w:numId w:val="2"/>
+        </w:numPr>
+        <w:spacing w:after="40" w:before="40"/>
+      </w:pPr>
+      <w:r>
+        <w:rPr>
+          <w:rFonts w:ascii="Arial" w:cs="Arial" w:eastAsia="Arial" w:hAnsi="Arial"/>
+          <w:sz w:val="22"/>
+          <w:szCs w:val="22"/>
+        </w:rPr>
+        <w:t xml:space="preserve">Alle visuellen Elemente (Logo, Animationen, Dekoration) sind als inline SVG-Code direkt in der HTML-Datei programmiert – keine Bilddateien, keine Cliparts, keine Icons von Drittanbietern.</w:t>
+      </w:r>
+    </w:p>
+    <w:p>
+      <w:pPr>
+        <w:pStyle w:val="ListParagraph"/>
+        <w:numPr>
+          <w:ilvl w:val="0"/>
+          <w:numId w:val="2"/>
+        </w:numPr>
+        <w:spacing w:after="40" w:before="40"/>
+      </w:pPr>
+      <w:r>
+        <w:rPr>
+          <w:rFonts w:ascii="Arial" w:cs="Arial" w:eastAsia="Arial" w:hAnsi="Arial"/>
+          <w:sz w:val="22"/>
+          <w:szCs w:val="22"/>
+        </w:rPr>
+        <w:t xml:space="preserve">Die Klimadiagramme (Temperaturabweichung seit 1881, Meeresspiegelanstieg) sind eigene SVG-Darstellungen auf Basis öffentlich zugänglicher NOAA-Klimadaten. Sie reproduzieren keine urheberrechtlich geschützten Abbildungen aus dem Schulbuch.</w:t>
+      </w:r>
+    </w:p>
+    <w:p>
+      <w:pPr>
+        <w:pStyle w:val="ListParagraph"/>
+        <w:numPr>
+          <w:ilvl w:val="0"/>
+          <w:numId w:val="2"/>
+        </w:numPr>
+        <w:spacing w:after="40" w:before="40"/>
+      </w:pPr>
+      <w:r>
+        <w:rPr>
+          <w:rFonts w:ascii="Arial" w:cs="Arial" w:eastAsia="Arial" w:hAnsi="Arial"/>
+          <w:sz w:val="22"/>
+          <w:szCs w:val="22"/>
+        </w:rPr>
+        <w:t xml:space="preserve">Es sind keine externen Bibliotheken, Frameworks oder CDN-Ressourcen eingebunden. Der gesamte Code ist eigenständig und lizenzfrei.</w:t>
+      </w:r>
+    </w:p>
+    <w:p>
+      <w:pPr>
+        <w:spacing w:after="60" w:before="0"/>
+      </w:pPr>
+      <w:r>
+        <w:t xml:space="preserve"/>
+      </w:r>
+    </w:p>
+    <w:p>
+      <w:pPr>
+        <w:pStyle w:val="Heading3"/>
+        <w:spacing w:after="60" w:before="200"/>
+      </w:pPr>
+      <w:r>
+        <w:rPr>
+          <w:rFonts w:ascii="Arial" w:cs="Arial" w:eastAsia="Arial" w:hAnsi="Arial"/>
+          <w:b/>
+          <w:bCs/>
+          <w:color w:val="1A3A5C"/>
+          <w:sz w:val="22"/>
+          <w:szCs w:val="22"/>
+        </w:rPr>
+        <w:t xml:space="preserve">Urheberrecht – Schulbuchinhalte</w:t>
+      </w:r>
+    </w:p>
+    <w:p>
+      <w:pPr>
+        <w:spacing w:after="100" w:before="60"/>
+        <w:jc w:val="both"/>
+      </w:pPr>
+      <w:r>
+        <w:rPr>
+          <w:rFonts w:ascii="Arial" w:cs="Arial" w:eastAsia="Arial" w:hAnsi="Arial"/>
+          <w:color w:val="000000"/>
+          <w:sz w:val="22"/>
+          <w:szCs w:val="22"/>
+        </w:rPr>
+        <w:t xml:space="preserve">Die Rätsel des Escape Rooms sind so konzipiert, dass sie Schulbuchinhalte nicht reproduzieren, sondern auf sie verweisen:</w:t>
+      </w:r>
+    </w:p>
+    <w:p>
+      <w:pPr>
+        <w:pStyle w:val="ListParagraph"/>
+        <w:numPr>
+          <w:ilvl w:val="0"/>
+          <w:numId w:val="2"/>
+        </w:numPr>
+        <w:spacing w:after="40" w:before="40"/>
+      </w:pPr>
+      <w:r>
+        <w:rPr>
+          <w:rFonts w:ascii="Arial" w:cs="Arial" w:eastAsia="Arial" w:hAnsi="Arial"/>
+          <w:sz w:val="22"/>
+          <w:szCs w:val="22"/>
+        </w:rPr>
+        <w:t xml:space="preserve">Kein Fließtext aus dem Lehrbuch wird wörtlich wiedergegeben. Die Aufgaben enthalten lediglich eigene Frageformulierungen sowie präzise Seitenangaben (z. B. „S. 138, T1").</w:t>
+      </w:r>
+    </w:p>
+    <w:p>
+      <w:pPr>
+        <w:pStyle w:val="ListParagraph"/>
+        <w:numPr>
+          <w:ilvl w:val="0"/>
+          <w:numId w:val="2"/>
+        </w:numPr>
+        <w:spacing w:after="40" w:before="40"/>
+      </w:pPr>
+      <w:r>
+        <w:rPr>
+          <w:rFonts w:ascii="Arial" w:cs="Arial" w:eastAsia="Arial" w:hAnsi="Arial"/>
+          <w:sz w:val="22"/>
+          <w:szCs w:val="22"/>
+        </w:rPr>
+        <w:t xml:space="preserve">Die Schülerinnen und Schüler müssen das Schulbuch selbst lesen, um die Rätsel lösen zu können. Es handelt sich um eine werkzeuggestützte Übungsform, nicht um eine Reproduktion des Werks.</w:t>
+      </w:r>
+    </w:p>
+    <w:p>
+      <w:pPr>
+        <w:pStyle w:val="ListParagraph"/>
+        <w:numPr>
+          <w:ilvl w:val="0"/>
+          <w:numId w:val="2"/>
+        </w:numPr>
+        <w:spacing w:after="40" w:before="40"/>
+      </w:pPr>
+      <w:r>
+        <w:rPr>
+          <w:rFonts w:ascii="Arial" w:cs="Arial" w:eastAsia="Arial" w:hAnsi="Arial"/>
+          <w:sz w:val="22"/>
+          <w:szCs w:val="22"/>
+        </w:rPr>
+        <w:t xml:space="preserve">Diese Form der Nutzung ist nach § 60a UrhG (Unterricht und Lehre) als zulässig einzustufen, da Inhalte zur Veranschaulichung des Unterrichts in nicht-kommerziellem Rahmen verwendet werden.</w:t>
+      </w:r>
+    </w:p>
+    <w:p>
+      <w:pPr>
+        <w:spacing w:after="60" w:before="0"/>
+      </w:pPr>
+      <w:r>
+        <w:t xml:space="preserve"/>
+      </w:r>
+    </w:p>
+    <w:p>
+      <w:pPr>
+        <w:pStyle w:val="Heading3"/>
+        <w:spacing w:after="60" w:before="200"/>
+      </w:pPr>
+      <w:r>
+        <w:rPr>
+          <w:rFonts w:ascii="Arial" w:cs="Arial" w:eastAsia="Arial" w:hAnsi="Arial"/>
+          <w:b/>
+          <w:bCs/>
+          <w:color w:val="1A3A5C"/>
+          <w:sz w:val="22"/>
+          <w:szCs w:val="22"/>
+        </w:rPr>
+        <w:t xml:space="preserve">Zusammenfassung: Rechtsstatus</w:t>
+      </w:r>
+    </w:p>
+    <w:tbl>
+      <w:tblPr>
+        <w:tblW w:type="dxa" w:w="9026"/>
+        <w:tblBorders>
+          <w:top w:val="single" w:color="auto" w:sz="4"/>
+          <w:left w:val="single" w:color="auto" w:sz="4"/>
+          <w:bottom w:val="single" w:color="auto" w:sz="4"/>
+          <w:right w:val="single" w:color="auto" w:sz="4"/>
+          <w:insideH w:val="single" w:color="auto" w:sz="4"/>
+          <w:insideV w:val="single" w:color="auto" w:sz="4"/>
+        </w:tblBorders>
+      </w:tblPr>
+      <w:tblGrid>
+        <w:gridCol w:w="2800"/>
+        <w:gridCol w:w="2400"/>
+        <w:gridCol w:w="3826"/>
+      </w:tblGrid>
+      <w:tr>
+        <w:trPr>
+          <w:tblHeader/>
+        </w:trPr>
+        <w:tc>
+          <w:tcPr>
+            <w:tcW w:type="dxa" w:w="2800"/>
+            <w:tcBorders>
+              <w:top w:val="single" w:color="AABBD0" w:sz="4"/>
+              <w:left w:val="single" w:color="AABBD0" w:sz="4"/>
+              <w:bottom w:val="single" w:color="AABBD0" w:sz="4"/>
+              <w:right w:val="single" w:color="AABBD0" w:sz="4"/>
+            </w:tcBorders>
+            <w:shd w:fill="1A3A5C" w:val="clear"/>
+            <w:tcMar>
+              <w:top w:type="dxa" w:w="80"/>
+              <w:left w:type="dxa" w:w="120"/>
+              <w:bottom w:type="dxa" w:w="80"/>
+              <w:right w:type="dxa" w:w="120"/>
+            </w:tcMar>
+          </w:tcPr>
+          <w:p>
+            <w:r>
+              <w:rPr>
+                <w:rFonts w:ascii="Arial" w:cs="Arial" w:eastAsia="Arial" w:hAnsi="Arial"/>
+                <w:b/>
+                <w:bCs/>
+                <w:color w:val="FFFFFF"/>
+                <w:sz w:val="20"/>
+                <w:szCs w:val="20"/>
+              </w:rPr>
+              <w:t xml:space="preserve">Bereich</w:t>
+            </w:r>
+          </w:p>
+        </w:tc>
+        <w:tc>
+          <w:tcPr>
+            <w:tcW w:type="dxa" w:w="2400"/>
+            <w:tcBorders>
+              <w:top w:val="single" w:color="AABBD0" w:sz="4"/>
+              <w:left w:val="single" w:color="AABBD0" w:sz="4"/>
+              <w:bottom w:val="single" w:color="AABBD0" w:sz="4"/>
+              <w:right w:val="single" w:color="AABBD0" w:sz="4"/>
+            </w:tcBorders>
+            <w:shd w:fill="1A3A5C" w:val="clear"/>
+            <w:tcMar>
+              <w:top w:type="dxa" w:w="80"/>
+              <w:left w:type="dxa" w:w="120"/>
+              <w:bottom w:type="dxa" w:w="80"/>
+              <w:right w:type="dxa" w:w="120"/>
+            </w:tcMar>
+          </w:tcPr>
+          <w:p>
+            <w:r>
+              <w:rPr>
+                <w:rFonts w:ascii="Arial" w:cs="Arial" w:eastAsia="Arial" w:hAnsi="Arial"/>
+                <w:b/>
+                <w:bCs/>
+                <w:color w:val="FFFFFF"/>
+                <w:sz w:val="20"/>
+                <w:szCs w:val="20"/>
+              </w:rPr>
+              <w:t xml:space="preserve">Status</w:t>
+            </w:r>
+          </w:p>
+        </w:tc>
+        <w:tc>
+          <w:tcPr>
+            <w:tcW w:type="dxa" w:w="3826"/>
+            <w:tcBorders>
+              <w:top w:val="single" w:color="AABBD0" w:sz="4"/>
+              <w:left w:val="single" w:color="AABBD0" w:sz="4"/>
+              <w:bottom w:val="single" w:color="AABBD0" w:sz="4"/>
+              <w:right w:val="single" w:color="AABBD0" w:sz="4"/>
+            </w:tcBorders>
+            <w:shd w:fill="1A3A5C" w:val="clear"/>
+            <w:tcMar>
+              <w:top w:type="dxa" w:w="80"/>
+              <w:left w:type="dxa" w:w="120"/>
+              <w:bottom w:type="dxa" w:w="80"/>
+              <w:right w:type="dxa" w:w="120"/>
+            </w:tcMar>
+          </w:tcPr>
+          <w:p>
+            <w:r>
+              <w:rPr>
+                <w:rFonts w:ascii="Arial" w:cs="Arial" w:eastAsia="Arial" w:hAnsi="Arial"/>
+                <w:b/>
+                <w:bCs/>
+                <w:color w:val="FFFFFF"/>
+                <w:sz w:val="20"/>
+                <w:szCs w:val="20"/>
+              </w:rPr>
+              <w:t xml:space="preserve">Maßnahme</w:t>
+            </w:r>
+          </w:p>
+        </w:tc>
+      </w:tr>
+      <w:tr>
+        <w:tc>
+          <w:tcPr>
+            <w:tcW w:type="dxa" w:w="2800"/>
+            <w:tcBorders>
+              <w:top w:val="single" w:color="AABBD0" w:sz="4"/>
+              <w:left w:val="single" w:color="AABBD0" w:sz="4"/>
+              <w:bottom w:val="single" w:color="AABBD0" w:sz="4"/>
+              <w:right w:val="single" w:color="AABBD0" w:sz="4"/>
+            </w:tcBorders>
+            <w:shd w:fill="F2F4F7" w:val="clear"/>
+            <w:tcMar>
+              <w:top w:type="dxa" w:w="80"/>
+              <w:left w:type="dxa" w:w="120"/>
+              <w:bottom w:type="dxa" w:w="80"/>
+              <w:right w:type="dxa" w:w="120"/>
+            </w:tcMar>
+          </w:tcPr>
+          <w:p>
+            <w:r>
+              <w:rPr>
+                <w:rFonts w:ascii="Arial" w:cs="Arial" w:eastAsia="Arial" w:hAnsi="Arial"/>
+                <w:b w:val="false"/>
+                <w:bCs w:val="false"/>
+                <w:color w:val="000000"/>
+                <w:sz w:val="20"/>
+                <w:szCs w:val="20"/>
+              </w:rPr>
+              <w:t xml:space="preserve">Schriftarten (Fonts)</w:t>
+            </w:r>
+          </w:p>
+        </w:tc>
+        <w:tc>
+          <w:tcPr>
+            <w:tcW w:type="dxa" w:w="2400"/>
+            <w:tcBorders>
+              <w:top w:val="single" w:color="AABBD0" w:sz="4"/>
+              <w:left w:val="single" w:color="AABBD0" w:sz="4"/>
+              <w:bottom w:val="single" w:color="AABBD0" w:sz="4"/>
+              <w:right w:val="single" w:color="AABBD0" w:sz="4"/>
+            </w:tcBorders>
+            <w:shd w:fill="F2F4F7" w:val="clear"/>
+            <w:tcMar>
+              <w:top w:type="dxa" w:w="80"/>
+              <w:left w:type="dxa" w:w="120"/>
+              <w:bottom w:type="dxa" w:w="80"/>
+              <w:right w:type="dxa" w:w="120"/>
+            </w:tcMar>
+          </w:tcPr>
+          <w:p>
+            <w:r>
+              <w:rPr>
+                <w:rFonts w:ascii="Arial" w:cs="Arial" w:eastAsia="Arial" w:hAnsi="Arial"/>
+                <w:b w:val="false"/>
+                <w:bCs w:val="false"/>
+                <w:color w:val="000000"/>
+                <w:sz w:val="20"/>
+                <w:szCs w:val="20"/>
+              </w:rPr>
+              <w:t xml:space="preserve">✓ OFL 1.1 – frei nutzbar</w:t>
+            </w:r>
+          </w:p>
+        </w:tc>
+        <w:tc>
+          <w:tcPr>
+            <w:tcW w:type="dxa" w:w="3826"/>
+            <w:tcBorders>
+              <w:top w:val="single" w:color="AABBD0" w:sz="4"/>
+              <w:left w:val="single" w:color="AABBD0" w:sz="4"/>
+              <w:bottom w:val="single" w:color="AABBD0" w:sz="4"/>
+              <w:right w:val="single" w:color="AABBD0" w:sz="4"/>
+            </w:tcBorders>
+            <w:shd w:fill="F2F4F7" w:val="clear"/>
+            <w:tcMar>
+              <w:top w:type="dxa" w:w="80"/>
+              <w:left w:type="dxa" w:w="120"/>
+              <w:bottom w:type="dxa" w:w="80"/>
+              <w:right w:type="dxa" w:w="120"/>
+            </w:tcMar>
+          </w:tcPr>
+          <w:p>
+            <w:r>
+              <w:rPr>
+                <w:rFonts w:ascii="Arial" w:cs="Arial" w:eastAsia="Arial" w:hAnsi="Arial"/>
+                <w:b w:val="false"/>
+                <w:bCs w:val="false"/>
+                <w:color w:val="000000"/>
+                <w:sz w:val="20"/>
+                <w:szCs w:val="20"/>
+              </w:rPr>
+              <w:t xml:space="preserve">Lokal eingebettet, kein CDN</w:t>
+            </w:r>
+          </w:p>
+        </w:tc>
+      </w:tr>
+      <w:tr>
+        <w:tc>
+          <w:tcPr>
+            <w:tcW w:type="dxa" w:w="2800"/>
+            <w:tcBorders>
+              <w:top w:val="single" w:color="AABBD0" w:sz="4"/>
+              <w:left w:val="single" w:color="AABBD0" w:sz="4"/>
+              <w:bottom w:val="single" w:color="AABBD0" w:sz="4"/>
+              <w:right w:val="single" w:color="AABBD0" w:sz="4"/>
+            </w:tcBorders>
+            <w:shd w:fill="FFFFFF" w:val="clear"/>
+            <w:tcMar>
+              <w:top w:type="dxa" w:w="80"/>
+              <w:left w:type="dxa" w:w="120"/>
+              <w:bottom w:type="dxa" w:w="80"/>
+              <w:right w:type="dxa" w:w="120"/>
+            </w:tcMar>
+          </w:tcPr>
+          <w:p>
+            <w:r>
+              <w:rPr>
+                <w:rFonts w:ascii="Arial" w:cs="Arial" w:eastAsia="Arial" w:hAnsi="Arial"/>
+                <w:b w:val="false"/>
+                <w:bCs w:val="false"/>
+                <w:color w:val="000000"/>
+                <w:sz w:val="20"/>
+                <w:szCs w:val="20"/>
+              </w:rPr>
+              <w:t xml:space="preserve">Grafiken / Animationen</w:t>
+            </w:r>
+          </w:p>
+        </w:tc>
+        <w:tc>
+          <w:tcPr>
+            <w:tcW w:type="dxa" w:w="2400"/>
+            <w:tcBorders>
+              <w:top w:val="single" w:color="AABBD0" w:sz="4"/>
+              <w:left w:val="single" w:color="AABBD0" w:sz="4"/>
+              <w:bottom w:val="single" w:color="AABBD0" w:sz="4"/>
+              <w:right w:val="single" w:color="AABBD0" w:sz="4"/>
+            </w:tcBorders>
+            <w:shd w:fill="FFFFFF" w:val="clear"/>
+            <w:tcMar>
+              <w:top w:type="dxa" w:w="80"/>
+              <w:left w:type="dxa" w:w="120"/>
+              <w:bottom w:type="dxa" w:w="80"/>
+              <w:right w:type="dxa" w:w="120"/>
+            </w:tcMar>
+          </w:tcPr>
+          <w:p>
+            <w:r>
+              <w:rPr>
+                <w:rFonts w:ascii="Arial" w:cs="Arial" w:eastAsia="Arial" w:hAnsi="Arial"/>
+                <w:b w:val="false"/>
+                <w:bCs w:val="false"/>
+                <w:color w:val="000000"/>
+                <w:sz w:val="20"/>
+                <w:szCs w:val="20"/>
+              </w:rPr>
+              <w:t xml:space="preserve">✓ Eigenerstellt</w:t>
+            </w:r>
+          </w:p>
+        </w:tc>
+        <w:tc>
+          <w:tcPr>
+            <w:tcW w:type="dxa" w:w="3826"/>
+            <w:tcBorders>
+              <w:top w:val="single" w:color="AABBD0" w:sz="4"/>
+              <w:left w:val="single" w:color="AABBD0" w:sz="4"/>
+              <w:bottom w:val="single" w:color="AABBD0" w:sz="4"/>
+              <w:right w:val="single" w:color="AABBD0" w:sz="4"/>
+            </w:tcBorders>
+            <w:shd w:fill="FFFFFF" w:val="clear"/>
+            <w:tcMar>
+              <w:top w:type="dxa" w:w="80"/>
+              <w:left w:type="dxa" w:w="120"/>
+              <w:bottom w:type="dxa" w:w="80"/>
+              <w:right w:type="dxa" w:w="120"/>
+            </w:tcMar>
+          </w:tcPr>
+          <w:p>
+            <w:r>
+              <w:rPr>
+                <w:rFonts w:ascii="Arial" w:cs="Arial" w:eastAsia="Arial" w:hAnsi="Arial"/>
+                <w:b w:val="false"/>
+                <w:bCs w:val="false"/>
+                <w:color w:val="000000"/>
+                <w:sz w:val="20"/>
+                <w:szCs w:val="20"/>
+              </w:rPr>
+              <w:t xml:space="preserve">Inline SVG, kein Drittmaterial</w:t>
+            </w:r>
+          </w:p>
+        </w:tc>
+      </w:tr>
+      <w:tr>
+        <w:tc>
+          <w:tcPr>
+            <w:tcW w:type="dxa" w:w="2800"/>
+            <w:tcBorders>
+              <w:top w:val="single" w:color="AABBD0" w:sz="4"/>
+              <w:left w:val="single" w:color="AABBD0" w:sz="4"/>
+              <w:bottom w:val="single" w:color="AABBD0" w:sz="4"/>
+              <w:right w:val="single" w:color="AABBD0" w:sz="4"/>
+            </w:tcBorders>
+            <w:shd w:fill="F2F4F7" w:val="clear"/>
+            <w:tcMar>
+              <w:top w:type="dxa" w:w="80"/>
+              <w:left w:type="dxa" w:w="120"/>
+              <w:bottom w:type="dxa" w:w="80"/>
+              <w:right w:type="dxa" w:w="120"/>
+            </w:tcMar>
+          </w:tcPr>
+          <w:p>
+            <w:r>
+              <w:rPr>
+                <w:rFonts w:ascii="Arial" w:cs="Arial" w:eastAsia="Arial" w:hAnsi="Arial"/>
+                <w:b w:val="false"/>
+                <w:bCs w:val="false"/>
+                <w:color w:val="000000"/>
+                <w:sz w:val="20"/>
+                <w:szCs w:val="20"/>
+              </w:rPr>
+              <w:t xml:space="preserve">Diagramm-Daten</w:t>
+            </w:r>
+          </w:p>
+        </w:tc>
+        <w:tc>
+          <w:tcPr>
+            <w:tcW w:type="dxa" w:w="2400"/>
+            <w:tcBorders>
+              <w:top w:val="single" w:color="AABBD0" w:sz="4"/>
+              <w:left w:val="single" w:color="AABBD0" w:sz="4"/>
+              <w:bottom w:val="single" w:color="AABBD0" w:sz="4"/>
+              <w:right w:val="single" w:color="AABBD0" w:sz="4"/>
+            </w:tcBorders>
+            <w:shd w:fill="F2F4F7" w:val="clear"/>
+            <w:tcMar>
+              <w:top w:type="dxa" w:w="80"/>
+              <w:left w:type="dxa" w:w="120"/>
+              <w:bottom w:type="dxa" w:w="80"/>
+              <w:right w:type="dxa" w:w="120"/>
+            </w:tcMar>
+          </w:tcPr>
+          <w:p>
+            <w:r>
+              <w:rPr>
+                <w:rFonts w:ascii="Arial" w:cs="Arial" w:eastAsia="Arial" w:hAnsi="Arial"/>
+                <w:b w:val="false"/>
+                <w:bCs w:val="false"/>
+                <w:color w:val="000000"/>
+                <w:sz w:val="20"/>
+                <w:szCs w:val="20"/>
+              </w:rPr>
+              <w:t xml:space="preserve">✓ Öffentliche NOAA-Daten</w:t>
+            </w:r>
+          </w:p>
+        </w:tc>
+        <w:tc>
+          <w:tcPr>
+            <w:tcW w:type="dxa" w:w="3826"/>
+            <w:tcBorders>
+              <w:top w:val="single" w:color="AABBD0" w:sz="4"/>
+              <w:left w:val="single" w:color="AABBD0" w:sz="4"/>
+              <w:bottom w:val="single" w:color="AABBD0" w:sz="4"/>
+              <w:right w:val="single" w:color="AABBD0" w:sz="4"/>
+            </w:tcBorders>
+            <w:shd w:fill="F2F4F7" w:val="clear"/>
+            <w:tcMar>
+              <w:top w:type="dxa" w:w="80"/>
+              <w:left w:type="dxa" w:w="120"/>
+              <w:bottom w:type="dxa" w:w="80"/>
+              <w:right w:type="dxa" w:w="120"/>
+            </w:tcMar>
+          </w:tcPr>
+          <w:p>
+            <w:r>
+              <w:rPr>
+                <w:rFonts w:ascii="Arial" w:cs="Arial" w:eastAsia="Arial" w:hAnsi="Arial"/>
+                <w:b w:val="false"/>
+                <w:bCs w:val="false"/>
+                <w:color w:val="000000"/>
+                <w:sz w:val="20"/>
+                <w:szCs w:val="20"/>
+              </w:rPr>
+              <w:t xml:space="preserve">Eigenständige SVG-Darstellung</w:t>
+            </w:r>
+          </w:p>
+        </w:tc>
+      </w:tr>
+      <w:tr>
+        <w:tc>
+          <w:tcPr>
+            <w:tcW w:type="dxa" w:w="2800"/>
+            <w:tcBorders>
+              <w:top w:val="single" w:color="AABBD0" w:sz="4"/>
+              <w:left w:val="single" w:color="AABBD0" w:sz="4"/>
+              <w:bottom w:val="single" w:color="AABBD0" w:sz="4"/>
+              <w:right w:val="single" w:color="AABBD0" w:sz="4"/>
+            </w:tcBorders>
+            <w:shd w:fill="FFFFFF" w:val="clear"/>
+            <w:tcMar>
+              <w:top w:type="dxa" w:w="80"/>
+              <w:left w:type="dxa" w:w="120"/>
+              <w:bottom w:type="dxa" w:w="80"/>
+              <w:right w:type="dxa" w:w="120"/>
+            </w:tcMar>
+          </w:tcPr>
+          <w:p>
+            <w:r>
+              <w:rPr>
+                <w:rFonts w:ascii="Arial" w:cs="Arial" w:eastAsia="Arial" w:hAnsi="Arial"/>
+                <w:b w:val="false"/>
+                <w:bCs w:val="false"/>
+                <w:color w:val="000000"/>
+                <w:sz w:val="20"/>
+                <w:szCs w:val="20"/>
+              </w:rPr>
+              <w:t xml:space="preserve">Schulbuchinhalte</w:t>
+            </w:r>
+          </w:p>
+        </w:tc>
+        <w:tc>
+          <w:tcPr>
+            <w:tcW w:type="dxa" w:w="2400"/>
+            <w:tcBorders>
+              <w:top w:val="single" w:color="AABBD0" w:sz="4"/>
+              <w:left w:val="single" w:color="AABBD0" w:sz="4"/>
+              <w:bottom w:val="single" w:color="AABBD0" w:sz="4"/>
+              <w:right w:val="single" w:color="AABBD0" w:sz="4"/>
+            </w:tcBorders>
+            <w:shd w:fill="FFFFFF" w:val="clear"/>
+            <w:tcMar>
+              <w:top w:type="dxa" w:w="80"/>
+              <w:left w:type="dxa" w:w="120"/>
+              <w:bottom w:type="dxa" w:w="80"/>
+              <w:right w:type="dxa" w:w="120"/>
+            </w:tcMar>
+          </w:tcPr>
+          <w:p>
+            <w:r>
+              <w:rPr>
+                <w:rFonts w:ascii="Arial" w:cs="Arial" w:eastAsia="Arial" w:hAnsi="Arial"/>
+                <w:b w:val="false"/>
+                <w:bCs w:val="false"/>
+                <w:color w:val="000000"/>
+                <w:sz w:val="20"/>
+                <w:szCs w:val="20"/>
+              </w:rPr>
+              <w:t xml:space="preserve">✓ § 60a UrhG</w:t>
+            </w:r>
+          </w:p>
+        </w:tc>
+        <w:tc>
+          <w:tcPr>
+            <w:tcW w:type="dxa" w:w="3826"/>
+            <w:tcBorders>
+              <w:top w:val="single" w:color="AABBD0" w:sz="4"/>
+              <w:left w:val="single" w:color="AABBD0" w:sz="4"/>
+              <w:bottom w:val="single" w:color="AABBD0" w:sz="4"/>
+              <w:right w:val="single" w:color="AABBD0" w:sz="4"/>
+            </w:tcBorders>
+            <w:shd w:fill="FFFFFF" w:val="clear"/>
+            <w:tcMar>
+              <w:top w:type="dxa" w:w="80"/>
+              <w:left w:type="dxa" w:w="120"/>
+              <w:bottom w:type="dxa" w:w="80"/>
+              <w:right w:type="dxa" w:w="120"/>
+            </w:tcMar>
+          </w:tcPr>
+          <w:p>
+            <w:r>
+              <w:rPr>
+                <w:rFonts w:ascii="Arial" w:cs="Arial" w:eastAsia="Arial" w:hAnsi="Arial"/>
+                <w:b w:val="false"/>
+                <w:bCs w:val="false"/>
+                <w:color w:val="000000"/>
+                <w:sz w:val="20"/>
+                <w:szCs w:val="20"/>
+              </w:rPr>
+              <w:t xml:space="preserve">Nur Verweise, kein Volltext</w:t>
+            </w:r>
+          </w:p>
+        </w:tc>
+      </w:tr>
+      <w:tr>
+        <w:tc>
+          <w:tcPr>
+            <w:tcW w:type="dxa" w:w="2800"/>
+            <w:tcBorders>
+              <w:top w:val="single" w:color="AABBD0" w:sz="4"/>
+              <w:left w:val="single" w:color="AABBD0" w:sz="4"/>
+              <w:bottom w:val="single" w:color="AABBD0" w:sz="4"/>
+              <w:right w:val="single" w:color="AABBD0" w:sz="4"/>
+            </w:tcBorders>
+            <w:shd w:fill="F2F4F7" w:val="clear"/>
+            <w:tcMar>
+              <w:top w:type="dxa" w:w="80"/>
+              <w:left w:type="dxa" w:w="120"/>
+              <w:bottom w:type="dxa" w:w="80"/>
+              <w:right w:type="dxa" w:w="120"/>
+            </w:tcMar>
+          </w:tcPr>
+          <w:p>
+            <w:r>
+              <w:rPr>
+                <w:rFonts w:ascii="Arial" w:cs="Arial" w:eastAsia="Arial" w:hAnsi="Arial"/>
+                <w:b w:val="false"/>
+                <w:bCs w:val="false"/>
+                <w:color w:val="000000"/>
+                <w:sz w:val="20"/>
+                <w:szCs w:val="20"/>
+              </w:rPr>
+              <w:t xml:space="preserve">DSGVO / Datenschutz</w:t>
+            </w:r>
+          </w:p>
+        </w:tc>
+        <w:tc>
+          <w:tcPr>
+            <w:tcW w:type="dxa" w:w="2400"/>
+            <w:tcBorders>
+              <w:top w:val="single" w:color="AABBD0" w:sz="4"/>
+              <w:left w:val="single" w:color="AABBD0" w:sz="4"/>
+              <w:bottom w:val="single" w:color="AABBD0" w:sz="4"/>
+              <w:right w:val="single" w:color="AABBD0" w:sz="4"/>
+            </w:tcBorders>
+            <w:shd w:fill="F2F4F7" w:val="clear"/>
+            <w:tcMar>
+              <w:top w:type="dxa" w:w="80"/>
+              <w:left w:type="dxa" w:w="120"/>
+              <w:bottom w:type="dxa" w:w="80"/>
+              <w:right w:type="dxa" w:w="120"/>
+            </w:tcMar>
+          </w:tcPr>
+          <w:p>
+            <w:r>
+              <w:rPr>
+                <w:rFonts w:ascii="Arial" w:cs="Arial" w:eastAsia="Arial" w:hAnsi="Arial"/>
+                <w:b w:val="false"/>
+                <w:bCs w:val="false"/>
+                <w:color w:val="000000"/>
+                <w:sz w:val="20"/>
+                <w:szCs w:val="20"/>
+              </w:rPr>
+              <w:t xml:space="preserve">✓ Vollständig konform</w:t>
+            </w:r>
+          </w:p>
+        </w:tc>
+        <w:tc>
+          <w:tcPr>
+            <w:tcW w:type="dxa" w:w="3826"/>
+            <w:tcBorders>
+              <w:top w:val="single" w:color="AABBD0" w:sz="4"/>
+              <w:left w:val="single" w:color="AABBD0" w:sz="4"/>
+              <w:bottom w:val="single" w:color="AABBD0" w:sz="4"/>
+              <w:right w:val="single" w:color="AABBD0" w:sz="4"/>
+            </w:tcBorders>
+            <w:shd w:fill="F2F4F7" w:val="clear"/>
+            <w:tcMar>
+              <w:top w:type="dxa" w:w="80"/>
+              <w:left w:type="dxa" w:w="120"/>
+              <w:bottom w:type="dxa" w:w="80"/>
+              <w:right w:type="dxa" w:w="120"/>
+            </w:tcMar>
+          </w:tcPr>
+          <w:p>
+            <w:r>
+              <w:rPr>
+                <w:rFonts w:ascii="Arial" w:cs="Arial" w:eastAsia="Arial" w:hAnsi="Arial"/>
+                <w:b w:val="false"/>
+                <w:bCs w:val="false"/>
+                <w:color w:val="000000"/>
+                <w:sz w:val="20"/>
+                <w:szCs w:val="20"/>
+              </w:rPr>
+              <w:t xml:space="preserve">Keine externen Anfragen</w:t>
+            </w:r>
+          </w:p>
+        </w:tc>
+      </w:tr>
+      <w:tr>
+        <w:tc>
+          <w:tcPr>
+            <w:tcW w:type="dxa" w:w="2800"/>
+            <w:tcBorders>
+              <w:top w:val="single" w:color="AABBD0" w:sz="4"/>
+              <w:left w:val="single" w:color="AABBD0" w:sz="4"/>
+              <w:bottom w:val="single" w:color="AABBD0" w:sz="4"/>
+              <w:right w:val="single" w:color="AABBD0" w:sz="4"/>
+            </w:tcBorders>
+            <w:shd w:fill="FFFFFF" w:val="clear"/>
+            <w:tcMar>
+              <w:top w:type="dxa" w:w="80"/>
+              <w:left w:type="dxa" w:w="120"/>
+              <w:bottom w:type="dxa" w:w="80"/>
+              <w:right w:type="dxa" w:w="120"/>
+            </w:tcMar>
+          </w:tcPr>
+          <w:p>
+            <w:r>
+              <w:rPr>
+                <w:rFonts w:ascii="Arial" w:cs="Arial" w:eastAsia="Arial" w:hAnsi="Arial"/>
+                <w:b w:val="false"/>
+                <w:bCs w:val="false"/>
+                <w:color w:val="000000"/>
+                <w:sz w:val="20"/>
+                <w:szCs w:val="20"/>
+              </w:rPr>
+              <w:t xml:space="preserve">Schülerdaten</w:t>
+            </w:r>
+          </w:p>
+        </w:tc>
+        <w:tc>
+          <w:tcPr>
+            <w:tcW w:type="dxa" w:w="2400"/>
+            <w:tcBorders>
+              <w:top w:val="single" w:color="AABBD0" w:sz="4"/>
+              <w:left w:val="single" w:color="AABBD0" w:sz="4"/>
+              <w:bottom w:val="single" w:color="AABBD0" w:sz="4"/>
+              <w:right w:val="single" w:color="AABBD0" w:sz="4"/>
+            </w:tcBorders>
+            <w:shd w:fill="FFFFFF" w:val="clear"/>
+            <w:tcMar>
+              <w:top w:type="dxa" w:w="80"/>
+              <w:left w:type="dxa" w:w="120"/>
+              <w:bottom w:type="dxa" w:w="80"/>
+              <w:right w:type="dxa" w:w="120"/>
+            </w:tcMar>
+          </w:tcPr>
+          <w:p>
+            <w:r>
+              <w:rPr>
+                <w:rFonts w:ascii="Arial" w:cs="Arial" w:eastAsia="Arial" w:hAnsi="Arial"/>
+                <w:b w:val="false"/>
+                <w:bCs w:val="false"/>
+                <w:color w:val="000000"/>
+                <w:sz w:val="20"/>
+                <w:szCs w:val="20"/>
+              </w:rPr>
+              <w:t xml:space="preserve">✓ Keine Übermittlung</w:t>
+            </w:r>
+          </w:p>
+        </w:tc>
+        <w:tc>
+          <w:tcPr>
+            <w:tcW w:type="dxa" w:w="3826"/>
+            <w:tcBorders>
+              <w:top w:val="single" w:color="AABBD0" w:sz="4"/>
+              <w:left w:val="single" w:color="AABBD0" w:sz="4"/>
+              <w:bottom w:val="single" w:color="AABBD0" w:sz="4"/>
+              <w:right w:val="single" w:color="AABBD0" w:sz="4"/>
+            </w:tcBorders>
+            <w:shd w:fill="FFFFFF" w:val="clear"/>
+            <w:tcMar>
+              <w:top w:type="dxa" w:w="80"/>
+              <w:left w:type="dxa" w:w="120"/>
+              <w:bottom w:type="dxa" w:w="80"/>
+              <w:right w:type="dxa" w:w="120"/>
+            </w:tcMar>
+          </w:tcPr>
+          <w:p>
+            <w:r>
+              <w:rPr>
+                <w:rFonts w:ascii="Arial" w:cs="Arial" w:eastAsia="Arial" w:hAnsi="Arial"/>
+                <w:b w:val="false"/>
+                <w:bCs w:val="false"/>
+                <w:color w:val="000000"/>
+                <w:sz w:val="20"/>
+                <w:szCs w:val="20"/>
+              </w:rPr>
+              <w:t xml:space="preserve">Kein Server, kein Tracking</w:t>
+            </w:r>
+          </w:p>
+        </w:tc>
+      </w:tr>
+    </w:tbl>
+    <w:p>
       <w:r>
         <w:br w:type="page"/>
       </w:r>
@@ -4036,7 +5704,494 @@
           <w:sz w:val="32"/>
           <w:szCs w:val="32"/>
         </w:rPr>
-        <w:t xml:space="preserve">5  Lösungsbogen</w:t>
+        <w:t xml:space="preserve">5  Rechtliche Hinweise und Lizenzangaben</w:t>
+      </w:r>
+    </w:p>
+    <w:p>
+      <w:pPr>
+        <w:pStyle w:val="Heading2"/>
+        <w:spacing w:after="80" w:before="280"/>
+      </w:pPr>
+      <w:r>
+        <w:rPr>
+          <w:rFonts w:ascii="Arial" w:cs="Arial" w:eastAsia="Arial" w:hAnsi="Arial"/>
+          <w:b/>
+          <w:bCs/>
+          <w:color w:val="2E6FA3"/>
+          <w:sz w:val="26"/>
+          <w:szCs w:val="26"/>
+        </w:rPr>
+        <w:t xml:space="preserve">5.1  Lizenzangaben der eingebetteten Schriften</w:t>
+      </w:r>
+    </w:p>
+    <w:p>
+      <w:pPr>
+        <w:spacing w:after="100" w:before="60"/>
+        <w:jc w:val="both"/>
+      </w:pPr>
+      <w:r>
+        <w:rPr>
+          <w:rFonts w:ascii="Arial" w:cs="Arial" w:eastAsia="Arial" w:hAnsi="Arial"/>
+          <w:color w:val="000000"/>
+          <w:sz w:val="22"/>
+          <w:szCs w:val="22"/>
+        </w:rPr>
+        <w:t xml:space="preserve">Die folgenden Lizenzhinweise sind Bestandteil der OFL 1.1 und werden hiermit dokumentiert:</w:t>
+      </w:r>
+    </w:p>
+    <w:tbl>
+      <w:tblPr>
+        <w:tblW w:type="dxa" w:w="9026"/>
+        <w:tblBorders>
+          <w:top w:val="single" w:color="auto" w:sz="4"/>
+          <w:left w:val="single" w:color="auto" w:sz="4"/>
+          <w:bottom w:val="single" w:color="auto" w:sz="4"/>
+          <w:right w:val="single" w:color="auto" w:sz="4"/>
+          <w:insideH w:val="single" w:color="auto" w:sz="4"/>
+          <w:insideV w:val="single" w:color="auto" w:sz="4"/>
+        </w:tblBorders>
+      </w:tblPr>
+      <w:tblGrid>
+        <w:gridCol w:w="9026"/>
+      </w:tblGrid>
+      <w:tr>
+        <w:tc>
+          <w:tcPr>
+            <w:tcW w:type="dxa" w:w="9026"/>
+            <w:tcBorders>
+              <w:top w:val="single" w:color="BBBBBB" w:sz="4"/>
+              <w:left w:val="single" w:color="BBBBBB" w:sz="4"/>
+              <w:bottom w:val="single" w:color="BBBBBB" w:sz="4"/>
+              <w:right w:val="single" w:color="BBBBBB" w:sz="4"/>
+            </w:tcBorders>
+            <w:shd w:fill="2E6FA3" w:val="clear"/>
+            <w:tcMar>
+              <w:top w:type="dxa" w:w="80"/>
+              <w:left w:type="dxa" w:w="120"/>
+              <w:bottom w:type="dxa" w:w="80"/>
+              <w:right w:type="dxa" w:w="120"/>
+            </w:tcMar>
+          </w:tcPr>
+          <w:p>
+            <w:r>
+              <w:rPr>
+                <w:rFonts w:ascii="Arial" w:cs="Arial" w:eastAsia="Arial" w:hAnsi="Arial"/>
+                <w:b/>
+                <w:bCs/>
+                <w:color w:val="FFFFFF"/>
+                <w:sz w:val="22"/>
+                <w:szCs w:val="22"/>
+              </w:rPr>
+              <w:t xml:space="preserve">Orbitron</w:t>
+            </w:r>
+          </w:p>
+        </w:tc>
+      </w:tr>
+      <w:tr>
+        <w:tc>
+          <w:tcPr>
+            <w:tcW w:type="dxa" w:w="9026"/>
+            <w:tcBorders>
+              <w:top w:val="single" w:color="BBBBBB" w:sz="4"/>
+              <w:left w:val="single" w:color="BBBBBB" w:sz="4"/>
+              <w:bottom w:val="single" w:color="BBBBBB" w:sz="4"/>
+              <w:right w:val="single" w:color="BBBBBB" w:sz="4"/>
+            </w:tcBorders>
+            <w:shd w:fill="F2F4F7" w:val="clear"/>
+            <w:tcMar>
+              <w:top w:type="dxa" w:w="60"/>
+              <w:left w:type="dxa" w:w="120"/>
+              <w:bottom w:type="dxa" w:w="60"/>
+              <w:right w:type="dxa" w:w="120"/>
+            </w:tcMar>
+          </w:tcPr>
+          <w:p>
+            <w:pPr>
+              <w:spacing w:after="40" w:before="40"/>
+            </w:pPr>
+            <w:r>
+              <w:rPr>
+                <w:rFonts w:ascii="Arial" w:cs="Arial" w:eastAsia="Arial" w:hAnsi="Arial"/>
+                <w:sz w:val="22"/>
+                <w:szCs w:val="22"/>
+              </w:rPr>
+              <w:t xml:space="preserve">Copyright 2018 The Orbitron Project Authors (https://github.com/theleagueof/orbitron)</w:t>
+            </w:r>
+          </w:p>
+        </w:tc>
+      </w:tr>
+      <w:tr>
+        <w:tc>
+          <w:tcPr>
+            <w:tcW w:type="dxa" w:w="9026"/>
+            <w:tcBorders>
+              <w:top w:val="single" w:color="BBBBBB" w:sz="4"/>
+              <w:left w:val="single" w:color="BBBBBB" w:sz="4"/>
+              <w:bottom w:val="single" w:color="BBBBBB" w:sz="4"/>
+              <w:right w:val="single" w:color="BBBBBB" w:sz="4"/>
+            </w:tcBorders>
+            <w:shd w:fill="F2F4F7" w:val="clear"/>
+            <w:tcMar>
+              <w:top w:type="dxa" w:w="60"/>
+              <w:left w:type="dxa" w:w="120"/>
+              <w:bottom w:type="dxa" w:w="60"/>
+              <w:right w:type="dxa" w:w="120"/>
+            </w:tcMar>
+          </w:tcPr>
+          <w:p>
+            <w:pPr>
+              <w:spacing w:after="40" w:before="40"/>
+            </w:pPr>
+            <w:r>
+              <w:rPr>
+                <w:rFonts w:ascii="Arial" w:cs="Arial" w:eastAsia="Arial" w:hAnsi="Arial"/>
+                <w:sz w:val="22"/>
+                <w:szCs w:val="22"/>
+              </w:rPr>
+              <w:t xml:space="preserve">Lizenz: SIL Open Font License, Version 1.1 – https://openfontlicense.org</w:t>
+            </w:r>
+          </w:p>
+        </w:tc>
+      </w:tr>
+    </w:tbl>
+    <w:p>
+      <w:pPr>
+        <w:spacing w:after="40" w:before="0"/>
+      </w:pPr>
+      <w:r>
+        <w:t xml:space="preserve"/>
+      </w:r>
+    </w:p>
+    <w:tbl>
+      <w:tblPr>
+        <w:tblW w:type="dxa" w:w="9026"/>
+        <w:tblBorders>
+          <w:top w:val="single" w:color="auto" w:sz="4"/>
+          <w:left w:val="single" w:color="auto" w:sz="4"/>
+          <w:bottom w:val="single" w:color="auto" w:sz="4"/>
+          <w:right w:val="single" w:color="auto" w:sz="4"/>
+          <w:insideH w:val="single" w:color="auto" w:sz="4"/>
+          <w:insideV w:val="single" w:color="auto" w:sz="4"/>
+        </w:tblBorders>
+      </w:tblPr>
+      <w:tblGrid>
+        <w:gridCol w:w="9026"/>
+      </w:tblGrid>
+      <w:tr>
+        <w:tc>
+          <w:tcPr>
+            <w:tcW w:type="dxa" w:w="9026"/>
+            <w:tcBorders>
+              <w:top w:val="single" w:color="BBBBBB" w:sz="4"/>
+              <w:left w:val="single" w:color="BBBBBB" w:sz="4"/>
+              <w:bottom w:val="single" w:color="BBBBBB" w:sz="4"/>
+              <w:right w:val="single" w:color="BBBBBB" w:sz="4"/>
+            </w:tcBorders>
+            <w:shd w:fill="2E6FA3" w:val="clear"/>
+            <w:tcMar>
+              <w:top w:type="dxa" w:w="80"/>
+              <w:left w:type="dxa" w:w="120"/>
+              <w:bottom w:type="dxa" w:w="80"/>
+              <w:right w:type="dxa" w:w="120"/>
+            </w:tcMar>
+          </w:tcPr>
+          <w:p>
+            <w:r>
+              <w:rPr>
+                <w:rFonts w:ascii="Arial" w:cs="Arial" w:eastAsia="Arial" w:hAnsi="Arial"/>
+                <w:b/>
+                <w:bCs/>
+                <w:color w:val="FFFFFF"/>
+                <w:sz w:val="22"/>
+                <w:szCs w:val="22"/>
+              </w:rPr>
+              <w:t xml:space="preserve">JetBrains Mono</w:t>
+            </w:r>
+          </w:p>
+        </w:tc>
+      </w:tr>
+      <w:tr>
+        <w:tc>
+          <w:tcPr>
+            <w:tcW w:type="dxa" w:w="9026"/>
+            <w:tcBorders>
+              <w:top w:val="single" w:color="BBBBBB" w:sz="4"/>
+              <w:left w:val="single" w:color="BBBBBB" w:sz="4"/>
+              <w:bottom w:val="single" w:color="BBBBBB" w:sz="4"/>
+              <w:right w:val="single" w:color="BBBBBB" w:sz="4"/>
+            </w:tcBorders>
+            <w:shd w:fill="F2F4F7" w:val="clear"/>
+            <w:tcMar>
+              <w:top w:type="dxa" w:w="60"/>
+              <w:left w:type="dxa" w:w="120"/>
+              <w:bottom w:type="dxa" w:w="60"/>
+              <w:right w:type="dxa" w:w="120"/>
+            </w:tcMar>
+          </w:tcPr>
+          <w:p>
+            <w:pPr>
+              <w:spacing w:after="40" w:before="40"/>
+            </w:pPr>
+            <w:r>
+              <w:rPr>
+                <w:rFonts w:ascii="Arial" w:cs="Arial" w:eastAsia="Arial" w:hAnsi="Arial"/>
+                <w:sz w:val="22"/>
+                <w:szCs w:val="22"/>
+              </w:rPr>
+              <w:t xml:space="preserve">Copyright 2020 The JetBrains Mono Project Authors (https://github.com/JetBrains/JetBrainsMono)</w:t>
+            </w:r>
+          </w:p>
+        </w:tc>
+      </w:tr>
+      <w:tr>
+        <w:tc>
+          <w:tcPr>
+            <w:tcW w:type="dxa" w:w="9026"/>
+            <w:tcBorders>
+              <w:top w:val="single" w:color="BBBBBB" w:sz="4"/>
+              <w:left w:val="single" w:color="BBBBBB" w:sz="4"/>
+              <w:bottom w:val="single" w:color="BBBBBB" w:sz="4"/>
+              <w:right w:val="single" w:color="BBBBBB" w:sz="4"/>
+            </w:tcBorders>
+            <w:shd w:fill="F2F4F7" w:val="clear"/>
+            <w:tcMar>
+              <w:top w:type="dxa" w:w="60"/>
+              <w:left w:type="dxa" w:w="120"/>
+              <w:bottom w:type="dxa" w:w="60"/>
+              <w:right w:type="dxa" w:w="120"/>
+            </w:tcMar>
+          </w:tcPr>
+          <w:p>
+            <w:pPr>
+              <w:spacing w:after="40" w:before="40"/>
+            </w:pPr>
+            <w:r>
+              <w:rPr>
+                <w:rFonts w:ascii="Arial" w:cs="Arial" w:eastAsia="Arial" w:hAnsi="Arial"/>
+                <w:sz w:val="22"/>
+                <w:szCs w:val="22"/>
+              </w:rPr>
+              <w:t xml:space="preserve">Lizenz: SIL Open Font License, Version 1.1 – https://openfontlicense.org</w:t>
+            </w:r>
+          </w:p>
+        </w:tc>
+      </w:tr>
+    </w:tbl>
+    <w:p>
+      <w:pPr>
+        <w:spacing w:after="40" w:before="0"/>
+      </w:pPr>
+      <w:r>
+        <w:t xml:space="preserve"/>
+      </w:r>
+    </w:p>
+    <w:tbl>
+      <w:tblPr>
+        <w:tblW w:type="dxa" w:w="9026"/>
+        <w:tblBorders>
+          <w:top w:val="single" w:color="auto" w:sz="4"/>
+          <w:left w:val="single" w:color="auto" w:sz="4"/>
+          <w:bottom w:val="single" w:color="auto" w:sz="4"/>
+          <w:right w:val="single" w:color="auto" w:sz="4"/>
+          <w:insideH w:val="single" w:color="auto" w:sz="4"/>
+          <w:insideV w:val="single" w:color="auto" w:sz="4"/>
+        </w:tblBorders>
+      </w:tblPr>
+      <w:tblGrid>
+        <w:gridCol w:w="9026"/>
+      </w:tblGrid>
+      <w:tr>
+        <w:tc>
+          <w:tcPr>
+            <w:tcW w:type="dxa" w:w="9026"/>
+            <w:tcBorders>
+              <w:top w:val="single" w:color="BBBBBB" w:sz="4"/>
+              <w:left w:val="single" w:color="BBBBBB" w:sz="4"/>
+              <w:bottom w:val="single" w:color="BBBBBB" w:sz="4"/>
+              <w:right w:val="single" w:color="BBBBBB" w:sz="4"/>
+            </w:tcBorders>
+            <w:shd w:fill="2E6FA3" w:val="clear"/>
+            <w:tcMar>
+              <w:top w:type="dxa" w:w="80"/>
+              <w:left w:type="dxa" w:w="120"/>
+              <w:bottom w:type="dxa" w:w="80"/>
+              <w:right w:type="dxa" w:w="120"/>
+            </w:tcMar>
+          </w:tcPr>
+          <w:p>
+            <w:r>
+              <w:rPr>
+                <w:rFonts w:ascii="Arial" w:cs="Arial" w:eastAsia="Arial" w:hAnsi="Arial"/>
+                <w:b/>
+                <w:bCs/>
+                <w:color w:val="FFFFFF"/>
+                <w:sz w:val="22"/>
+                <w:szCs w:val="22"/>
+              </w:rPr>
+              <w:t xml:space="preserve">Manrope</w:t>
+            </w:r>
+          </w:p>
+        </w:tc>
+      </w:tr>
+      <w:tr>
+        <w:tc>
+          <w:tcPr>
+            <w:tcW w:type="dxa" w:w="9026"/>
+            <w:tcBorders>
+              <w:top w:val="single" w:color="BBBBBB" w:sz="4"/>
+              <w:left w:val="single" w:color="BBBBBB" w:sz="4"/>
+              <w:bottom w:val="single" w:color="BBBBBB" w:sz="4"/>
+              <w:right w:val="single" w:color="BBBBBB" w:sz="4"/>
+            </w:tcBorders>
+            <w:shd w:fill="F2F4F7" w:val="clear"/>
+            <w:tcMar>
+              <w:top w:type="dxa" w:w="60"/>
+              <w:left w:type="dxa" w:w="120"/>
+              <w:bottom w:type="dxa" w:w="60"/>
+              <w:right w:type="dxa" w:w="120"/>
+            </w:tcMar>
+          </w:tcPr>
+          <w:p>
+            <w:pPr>
+              <w:spacing w:after="40" w:before="40"/>
+            </w:pPr>
+            <w:r>
+              <w:rPr>
+                <w:rFonts w:ascii="Arial" w:cs="Arial" w:eastAsia="Arial" w:hAnsi="Arial"/>
+                <w:sz w:val="22"/>
+                <w:szCs w:val="22"/>
+              </w:rPr>
+              <w:t xml:space="preserve">Copyright 2018 The Manrope Project Authors (https://github.com/sharanda/manrope)</w:t>
+            </w:r>
+          </w:p>
+        </w:tc>
+      </w:tr>
+      <w:tr>
+        <w:tc>
+          <w:tcPr>
+            <w:tcW w:type="dxa" w:w="9026"/>
+            <w:tcBorders>
+              <w:top w:val="single" w:color="BBBBBB" w:sz="4"/>
+              <w:left w:val="single" w:color="BBBBBB" w:sz="4"/>
+              <w:bottom w:val="single" w:color="BBBBBB" w:sz="4"/>
+              <w:right w:val="single" w:color="BBBBBB" w:sz="4"/>
+            </w:tcBorders>
+            <w:shd w:fill="F2F4F7" w:val="clear"/>
+            <w:tcMar>
+              <w:top w:type="dxa" w:w="60"/>
+              <w:left w:type="dxa" w:w="120"/>
+              <w:bottom w:type="dxa" w:w="60"/>
+              <w:right w:type="dxa" w:w="120"/>
+            </w:tcMar>
+          </w:tcPr>
+          <w:p>
+            <w:pPr>
+              <w:spacing w:after="40" w:before="40"/>
+            </w:pPr>
+            <w:r>
+              <w:rPr>
+                <w:rFonts w:ascii="Arial" w:cs="Arial" w:eastAsia="Arial" w:hAnsi="Arial"/>
+                <w:sz w:val="22"/>
+                <w:szCs w:val="22"/>
+              </w:rPr>
+              <w:t xml:space="preserve">Lizenz: SIL Open Font License, Version 1.1 – https://openfontlicense.org</w:t>
+            </w:r>
+          </w:p>
+        </w:tc>
+      </w:tr>
+    </w:tbl>
+    <w:p>
+      <w:pPr>
+        <w:spacing w:after="80" w:before="0"/>
+      </w:pPr>
+      <w:r>
+        <w:t xml:space="preserve"/>
+      </w:r>
+    </w:p>
+    <w:p>
+      <w:pPr>
+        <w:pStyle w:val="Heading2"/>
+        <w:spacing w:after="80" w:before="280"/>
+      </w:pPr>
+      <w:r>
+        <w:rPr>
+          <w:rFonts w:ascii="Arial" w:cs="Arial" w:eastAsia="Arial" w:hAnsi="Arial"/>
+          <w:b/>
+          <w:bCs/>
+          <w:color w:val="2E6FA3"/>
+          <w:sz w:val="26"/>
+          <w:szCs w:val="26"/>
+        </w:rPr>
+        <w:t xml:space="preserve">5.2  Urheberrecht an der Escape-Room-Datei</w:t>
+      </w:r>
+    </w:p>
+    <w:p>
+      <w:pPr>
+        <w:spacing w:after="100" w:before="60"/>
+        <w:jc w:val="both"/>
+      </w:pPr>
+      <w:r>
+        <w:rPr>
+          <w:rFonts w:ascii="Arial" w:cs="Arial" w:eastAsia="Arial" w:hAnsi="Arial"/>
+          <w:color w:val="000000"/>
+          <w:sz w:val="22"/>
+          <w:szCs w:val="22"/>
+        </w:rPr>
+        <w:t xml:space="preserve">Die HTML-Datei „klimawandel_escape.html" wurde auf Basis der Schulbucheinheit „Herausforderung Klimawandel" (Kapitel 7, Klett-Verlag) eigenständig konzipiert und programmiert. Die inhaltliche und gestalterische Umsetzung liegt beim Ersteller. Die Datei darf im schulischen Kontext frei eingesetzt, weitergegeben und angepasst werden. Eine kommerzielle Verwertung ist ohne Genehmigung des Erstellers nicht gestattet.</w:t>
+      </w:r>
+    </w:p>
+    <w:p>
+      <w:pPr>
+        <w:pStyle w:val="Heading2"/>
+        <w:spacing w:after="80" w:before="280"/>
+      </w:pPr>
+      <w:r>
+        <w:rPr>
+          <w:rFonts w:ascii="Arial" w:cs="Arial" w:eastAsia="Arial" w:hAnsi="Arial"/>
+          <w:b/>
+          <w:bCs/>
+          <w:color w:val="2E6FA3"/>
+          <w:sz w:val="26"/>
+          <w:szCs w:val="26"/>
+        </w:rPr>
+        <w:t xml:space="preserve">5.3  Datenschutzrechtliche Einordnung</w:t>
+      </w:r>
+    </w:p>
+    <w:p>
+      <w:pPr>
+        <w:spacing w:after="100" w:before="60"/>
+        <w:jc w:val="both"/>
+      </w:pPr>
+      <w:r>
+        <w:rPr>
+          <w:rFonts w:ascii="Arial" w:cs="Arial" w:eastAsia="Arial" w:hAnsi="Arial"/>
+          <w:color w:val="000000"/>
+          <w:sz w:val="22"/>
+          <w:szCs w:val="22"/>
+        </w:rPr>
+        <w:t xml:space="preserve">Die Datei erhebt, speichert oder überträgt keinerlei personenbezogene Daten. Es werden keine Cookies gesetzt. Eine Nutzung ist ohne Einwilligung der Erziehungsberechtigten unbedenklich möglich. Falls die Fortsetzen-Funktion genutzt wird, werden lediglich Teamname und Spielfortschritt im lokalen Browserspeicher (localStorage) des genutzten Geräts abgelegt – ausschließlich lokal, kein Server, kein Cloud-Dienst.</w:t>
+      </w:r>
+    </w:p>
+    <w:p>
+      <w:r>
+        <w:br w:type="page"/>
+      </w:r>
+    </w:p>
+    <w:p>
+      <w:pPr>
+        <w:pStyle w:val="Heading1"/>
+        <w:spacing w:after="120" w:before="360"/>
+      </w:pPr>
+      <w:r>
+        <w:rPr>
+          <w:rFonts w:ascii="Arial" w:cs="Arial" w:eastAsia="Arial" w:hAnsi="Arial"/>
+          <w:b/>
+          <w:bCs/>
+          <w:color w:val="1A3A5C"/>
+          <w:sz w:val="32"/>
+          <w:szCs w:val="32"/>
+        </w:rPr>
+        <w:t xml:space="preserve">6  Lösungsbogen</w:t>
       </w:r>
     </w:p>
     <w:p>

</xml_diff>